<commit_message>
feat(register): lesbarere Transliteration (˥→ʿ, s¹→s, s²→š)
Minimale, stille Leseform-Ersetzung beim Bau — ohne Erklärung im Vor- oder
Nachwort:
- ˥ (U+02E5) → ʿ: Fehlerbereinigung; ˥ war durchgängig ein verunglücktes ʿ
  (dieselben Namen standen in beiden Schreibungen: S¹˥d/S¹ʿd, ʾn˥m/ʾnʿm).
- s¹ → s (dezent), s² → š (Einzelglyph statt „sch").
- Übrige Diakritika (ṯ ḫ ḍ ṣ ṭ ẓ ġ ḥ) bewusst unverändert.

Umgesetzt als Funktion readable() (Schalter READABLE) im Build-Skript: die
Datenquelle behält die exakte philologische Transliteration, die Leseform
wird beim Bau erzeugt und ist jederzeit umkehrbar. Docx neu gebaut; im Band
keine ˥/s¹/s² mehr. Transform-Tabelle in REGISTER_BAND_AUSWAHL.md vermerkt.

Co-Authored-By: Claude Opus 4.8 <noreply@anthropic.com>
Claude-Session: https://claude.ai/code/session_014bcwQ5jz9EH6bJZQXZEKgN
</commit_message>
<xml_diff>
--- a/safaitic-research/Poetics/register/wer_dies_liest_register_v5.docx
+++ b/safaitic-research/Poetics/register/wer_dies_liest_register_v5.docx
@@ -165,15 +165,15 @@
         <w:spacing w:after="40"/>
       </w:pPr>
       <w:r>
-        <w:t xml:space="preserve">Von Msk, Sohn des S²dt,</w:t>
-      </w:r>
-    </w:p>
-    <w:p>
-      <w:pPr>
-        <w:spacing w:after="40"/>
-      </w:pPr>
-      <w:r>
-        <w:t xml:space="preserve">Sohn des Mḥlm, Sohn des S²dt,</w:t>
+        <w:t xml:space="preserve">Von Msk, Sohn des Šdt,</w:t>
+      </w:r>
+    </w:p>
+    <w:p>
+      <w:pPr>
+        <w:spacing w:after="40"/>
+      </w:pPr>
+      <w:r>
+        <w:t xml:space="preserve">Sohn des Mḥlm, Sohn des Šdt,</w:t>
       </w:r>
     </w:p>
     <w:p>
@@ -218,7 +218,7 @@
         <w:spacing w:after="40"/>
       </w:pPr>
       <w:r>
-        <w:t xml:space="preserve">Sohn des S²dt, Sohn des Mḥlm,</w:t>
+        <w:t xml:space="preserve">Sohn des Šdt, Sohn des Mḥlm,</w:t>
       </w:r>
     </w:p>
     <w:p>
@@ -247,15 +247,15 @@
         <w:spacing w:after="40"/>
       </w:pPr>
       <w:r>
-        <w:t xml:space="preserve">Von Gs²m, Sohn des S¹mr,</w:t>
-      </w:r>
-    </w:p>
-    <w:p>
-      <w:pPr>
-        <w:spacing w:after="40"/>
-      </w:pPr>
-      <w:r>
-        <w:t xml:space="preserve">vom Stamm Bs¹ʾ.</w:t>
+        <w:t xml:space="preserve">Von Gšm, Sohn des Smr,</w:t>
+      </w:r>
+    </w:p>
+    <w:p>
+      <w:pPr>
+        <w:spacing w:after="40"/>
+      </w:pPr>
+      <w:r>
+        <w:t xml:space="preserve">vom Stamm Bsʾ.</w:t>
       </w:r>
     </w:p>
     <w:p>
@@ -292,7 +292,7 @@
         <w:spacing w:after="40"/>
       </w:pPr>
       <w:r>
-        <w:t xml:space="preserve">Sohn des S¹fʾ, Sohn des Ḥnf.</w:t>
+        <w:t xml:space="preserve">Sohn des Sfʾ, Sohn des Ḥnf.</w:t>
       </w:r>
     </w:p>
     <w:p>
@@ -342,7 +342,7 @@
         <w:spacing w:after="40"/>
       </w:pPr>
       <w:r>
-        <w:t xml:space="preserve">Von Hnʾ, Sohn des S²nʾ,</w:t>
+        <w:t xml:space="preserve">Von Hnʾ, Sohn des Šnʾ,</w:t>
       </w:r>
     </w:p>
     <w:p>
@@ -379,7 +379,7 @@
         <w:spacing w:after="40"/>
       </w:pPr>
       <w:r>
-        <w:t xml:space="preserve">Sohn des Tm, Sohn des S²ʿ.</w:t>
+        <w:t xml:space="preserve">Sohn des Tm, Sohn des Šʿ.</w:t>
       </w:r>
     </w:p>
     <w:p>
@@ -408,7 +408,7 @@
         <w:spacing w:after="40"/>
       </w:pPr>
       <w:r>
-        <w:t xml:space="preserve">Von S¹ʿd, Sohn des Ẓn, Sohn des Ṯlm.</w:t>
+        <w:t xml:space="preserve">Von Sʿd, Sohn des Ẓn, Sohn des Ṯlm.</w:t>
       </w:r>
     </w:p>
     <w:p>
@@ -437,7 +437,7 @@
         <w:spacing w:after="40"/>
       </w:pPr>
       <w:r>
-        <w:t xml:space="preserve">Von ʿrb, Sohn des Hrs¹.</w:t>
+        <w:t xml:space="preserve">Von ʿrb, Sohn des Hrs.</w:t>
       </w:r>
     </w:p>
     <w:p>
@@ -482,15 +482,15 @@
         <w:spacing w:after="40"/>
       </w:pPr>
       <w:r>
-        <w:t xml:space="preserve">Sohn des Hs¹m, Sohn des Gḥs²t,</w:t>
-      </w:r>
-    </w:p>
-    <w:p>
-      <w:pPr>
-        <w:spacing w:after="40"/>
-      </w:pPr>
-      <w:r>
-        <w:t xml:space="preserve">Sohn des S¹dy, Sohn des Wṭy,</w:t>
+        <w:t xml:space="preserve">Sohn des Hsm, Sohn des Gḥšt,</w:t>
+      </w:r>
+    </w:p>
+    <w:p>
+      <w:pPr>
+        <w:spacing w:after="40"/>
+      </w:pPr>
+      <w:r>
+        <w:t xml:space="preserve">Sohn des Sdy, Sohn des Wṭy,</w:t>
       </w:r>
     </w:p>
     <w:p>
@@ -535,7 +535,7 @@
         <w:spacing w:after="40"/>
       </w:pPr>
       <w:r>
-        <w:t xml:space="preserve">Sohn des Gṯ, Sohn des S²ʿr,</w:t>
+        <w:t xml:space="preserve">Sohn des Gṯ, Sohn des Šʿr,</w:t>
       </w:r>
     </w:p>
     <w:p>
@@ -580,7 +580,7 @@
         <w:spacing w:after="40"/>
       </w:pPr>
       <w:r>
-        <w:t xml:space="preserve">Sohn des Mṯn, Sohn des S²ʿhm,</w:t>
+        <w:t xml:space="preserve">Sohn des Mṯn, Sohn des Šʿhm,</w:t>
       </w:r>
     </w:p>
     <w:p>
@@ -617,15 +617,15 @@
         <w:spacing w:after="40"/>
       </w:pPr>
       <w:r>
-        <w:t xml:space="preserve">Von Hnʾt, Sohn des S¹lmt,</w:t>
-      </w:r>
-    </w:p>
-    <w:p>
-      <w:pPr>
-        <w:spacing w:after="40"/>
-      </w:pPr>
-      <w:r>
-        <w:t xml:space="preserve">Sohn des Lḏn, Sohn des S¹krn,</w:t>
+        <w:t xml:space="preserve">Von Hnʾt, Sohn des Slmt,</w:t>
+      </w:r>
+    </w:p>
+    <w:p>
+      <w:pPr>
+        <w:spacing w:after="40"/>
+      </w:pPr>
+      <w:r>
+        <w:t xml:space="preserve">Sohn des Lḏn, Sohn des Skrn,</w:t>
       </w:r>
     </w:p>
     <w:p>
@@ -654,15 +654,15 @@
         <w:spacing w:after="40"/>
       </w:pPr>
       <w:r>
-        <w:t xml:space="preserve">Von Kmn, Sohn des S¹lmt,</w:t>
-      </w:r>
-    </w:p>
-    <w:p>
-      <w:pPr>
-        <w:spacing w:after="40"/>
-      </w:pPr>
-      <w:r>
-        <w:t xml:space="preserve">Sohn des Lḏn, Sohn des S¹krn,</w:t>
+        <w:t xml:space="preserve">Von Kmn, Sohn des Slmt,</w:t>
+      </w:r>
+    </w:p>
+    <w:p>
+      <w:pPr>
+        <w:spacing w:after="40"/>
+      </w:pPr>
+      <w:r>
+        <w:t xml:space="preserve">Sohn des Lḏn, Sohn des Skrn,</w:t>
       </w:r>
     </w:p>
     <w:p>
@@ -834,7 +834,7 @@
         <w:spacing w:after="40"/>
       </w:pPr>
       <w:r>
-        <w:t xml:space="preserve">Von S²rk —</w:t>
+        <w:t xml:space="preserve">Von Šrk —</w:t>
       </w:r>
     </w:p>
     <w:p>
@@ -892,7 +892,7 @@
         <w:spacing w:after="40"/>
       </w:pPr>
       <w:r>
-        <w:t xml:space="preserve">Von ʿṭs¹.</w:t>
+        <w:t xml:space="preserve">Von ʿṭs.</w:t>
       </w:r>
     </w:p>
     <w:p>
@@ -955,7 +955,7 @@
         <w:spacing w:after="40"/>
       </w:pPr>
       <w:r>
-        <w:t xml:space="preserve">Von S¹ḫr.</w:t>
+        <w:t xml:space="preserve">Von Sḫr.</w:t>
       </w:r>
     </w:p>
     <w:p>
@@ -976,7 +976,7 @@
         <w:spacing w:after="40"/>
       </w:pPr>
       <w:r>
-        <w:t xml:space="preserve">Von Gḥs².</w:t>
+        <w:t xml:space="preserve">Von Gḥš.</w:t>
       </w:r>
     </w:p>
     <w:p>
@@ -997,7 +997,7 @@
         <w:spacing w:after="40"/>
       </w:pPr>
       <w:r>
-        <w:t xml:space="preserve">Von S¹ʿd.</w:t>
+        <w:t xml:space="preserve">Von Sʿd.</w:t>
       </w:r>
     </w:p>
     <w:p>
@@ -1018,7 +1018,7 @@
         <w:spacing w:after="40"/>
       </w:pPr>
       <w:r>
-        <w:t xml:space="preserve">Von Gḥs².</w:t>
+        <w:t xml:space="preserve">Von Gḥš.</w:t>
       </w:r>
     </w:p>
     <w:p>
@@ -1039,7 +1039,7 @@
         <w:spacing w:after="40"/>
       </w:pPr>
       <w:r>
-        <w:t xml:space="preserve">Von S¹lf.</w:t>
+        <w:t xml:space="preserve">Von Slf.</w:t>
       </w:r>
     </w:p>
     <w:p>
@@ -1081,7 +1081,7 @@
         <w:spacing w:after="40"/>
       </w:pPr>
       <w:r>
-        <w:t xml:space="preserve">Von S²d.</w:t>
+        <w:t xml:space="preserve">Von Šd.</w:t>
       </w:r>
     </w:p>
     <w:p>
@@ -1123,7 +1123,7 @@
         <w:spacing w:after="40"/>
       </w:pPr>
       <w:r>
-        <w:t xml:space="preserve">Von S¹drt.</w:t>
+        <w:t xml:space="preserve">Von Sdrt.</w:t>
       </w:r>
     </w:p>
     <w:p>
@@ -1176,15 +1176,15 @@
         <w:spacing w:after="40"/>
       </w:pPr>
       <w:r>
-        <w:t xml:space="preserve">Von Rbʾl, Sohn des Ḥnn, Sohn des Ẓ˥n,</w:t>
-      </w:r>
-    </w:p>
-    <w:p>
-      <w:pPr>
-        <w:spacing w:after="40"/>
-      </w:pPr>
-      <w:r>
-        <w:t xml:space="preserve">Sohn des Ḫyḏ, Sohn des ˥ḏr.</w:t>
+        <w:t xml:space="preserve">Von Rbʾl, Sohn des Ḥnn, Sohn des Ẓʿn,</w:t>
+      </w:r>
+    </w:p>
+    <w:p>
+      <w:pPr>
+        <w:spacing w:after="40"/>
+      </w:pPr>
+      <w:r>
+        <w:t xml:space="preserve">Sohn des Ḫyḏ, Sohn des ʿḏr.</w:t>
       </w:r>
     </w:p>
     <w:p>
@@ -1475,15 +1475,15 @@
         <w:spacing w:after="40"/>
       </w:pPr>
       <w:r>
-        <w:t xml:space="preserve">Von Ms¹wd, Sohn des Whbn,</w:t>
-      </w:r>
-    </w:p>
-    <w:p>
-      <w:pPr>
-        <w:spacing w:after="40"/>
-      </w:pPr>
-      <w:r>
-        <w:t xml:space="preserve">Sohn des Hrṯ, Sohn des Ms¹k,</w:t>
+        <w:t xml:space="preserve">Von Mswd, Sohn des Whbn,</w:t>
+      </w:r>
+    </w:p>
+    <w:p>
+      <w:pPr>
+        <w:spacing w:after="40"/>
+      </w:pPr>
+      <w:r>
+        <w:t xml:space="preserve">Sohn des Hrṯ, Sohn des Msk,</w:t>
       </w:r>
     </w:p>
     <w:p>
@@ -1536,15 +1536,15 @@
         <w:spacing w:after="40"/>
       </w:pPr>
       <w:r>
-        <w:t xml:space="preserve">Von S¹ʿd, Sohn des Ġyrʾl,</w:t>
-      </w:r>
-    </w:p>
-    <w:p>
-      <w:pPr>
-        <w:spacing w:after="40"/>
-      </w:pPr>
-      <w:r>
-        <w:t xml:space="preserve">Sohn des S¹krn, Sohn des Zkr,</w:t>
+        <w:t xml:space="preserve">Von Sʿd, Sohn des Ġyrʾl,</w:t>
+      </w:r>
+    </w:p>
+    <w:p>
+      <w:pPr>
+        <w:spacing w:after="40"/>
+      </w:pPr>
+      <w:r>
+        <w:t xml:space="preserve">Sohn des Skrn, Sohn des Zkr,</w:t>
       </w:r>
     </w:p>
     <w:p>
@@ -2545,7 +2545,7 @@
         <w:spacing w:after="40"/>
       </w:pPr>
       <w:r>
-        <w:t xml:space="preserve">Von Nḏr, Sohn des ʾs¹,</w:t>
+        <w:t xml:space="preserve">Von Nḏr, Sohn des ʾs,</w:t>
       </w:r>
     </w:p>
     <w:p>
@@ -2582,7 +2582,7 @@
         <w:spacing w:after="40"/>
       </w:pPr>
       <w:r>
-        <w:t xml:space="preserve">Von Ḥḍg, Sohn des S¹wr ----.</w:t>
+        <w:t xml:space="preserve">Von Ḥḍg, Sohn des Swr ----.</w:t>
       </w:r>
     </w:p>
     <w:p>
@@ -2656,15 +2656,15 @@
         <w:spacing w:after="40"/>
       </w:pPr>
       <w:r>
-        <w:t xml:space="preserve">Von S¹˥d, Sohn des Gls¹, Sohn des Ṣ˥d,</w:t>
-      </w:r>
-    </w:p>
-    <w:p>
-      <w:pPr>
-        <w:spacing w:after="40"/>
-      </w:pPr>
-      <w:r>
-        <w:t xml:space="preserve">Sohn des Mḥlm, Sohn des ʾn˥m, Sohn des L˥ṯmn.</w:t>
+        <w:t xml:space="preserve">Von Sʿd, Sohn des Gls, Sohn des Ṣʿd,</w:t>
+      </w:r>
+    </w:p>
+    <w:p>
+      <w:pPr>
+        <w:spacing w:after="40"/>
+      </w:pPr>
+      <w:r>
+        <w:t xml:space="preserve">Sohn des Mḥlm, Sohn des ʾnʿm, Sohn des Lʿṯmn.</w:t>
       </w:r>
     </w:p>
     <w:p>
@@ -2712,7 +2712,7 @@
         <w:spacing w:after="40"/>
       </w:pPr>
       <w:r>
-        <w:t xml:space="preserve">und um ʾn˥m,</w:t>
+        <w:t xml:space="preserve">und um ʾnʿm,</w:t>
       </w:r>
     </w:p>
     <w:p>
@@ -2744,7 +2744,7 @@
         <w:spacing w:after="40"/>
       </w:pPr>
       <w:r>
-        <w:t xml:space="preserve">und um ˥ḥmn, der gefangen war, im Jahr des Qbr,</w:t>
+        <w:t xml:space="preserve">und um ʿḥmn, der gefangen war, im Jahr des Qbr,</w:t>
       </w:r>
     </w:p>
     <w:p>
@@ -2874,7 +2874,7 @@
         <w:spacing w:after="40"/>
       </w:pPr>
       <w:r>
-        <w:t xml:space="preserve">S²ʿh ----</w:t>
+        <w:t xml:space="preserve">Šʿh ----</w:t>
       </w:r>
     </w:p>
     <w:p>
@@ -2895,39 +2895,39 @@
         <w:spacing w:after="40"/>
       </w:pPr>
       <w:r>
-        <w:t xml:space="preserve">Von ʾs²ym, Sohn des Drʾl,</w:t>
-      </w:r>
-    </w:p>
-    <w:p>
-      <w:pPr>
-        <w:spacing w:after="40"/>
-      </w:pPr>
-      <w:r>
-        <w:t xml:space="preserve">Sohn des ʾs²ym, Sohn des Drʾl,</w:t>
-      </w:r>
-    </w:p>
-    <w:p>
-      <w:pPr>
-        <w:spacing w:after="40"/>
-      </w:pPr>
-      <w:r>
-        <w:t xml:space="preserve">Sohn des Ks¹t, Sohn des ʿbd …</w:t>
-      </w:r>
-    </w:p>
-    <w:p>
-      <w:pPr>
-        <w:spacing w:after="40"/>
-      </w:pPr>
-      <w:r>
-        <w:t xml:space="preserve">Sohn des S²rk —</w:t>
-      </w:r>
-    </w:p>
-    <w:p>
-      <w:pPr>
-        <w:spacing w:after="40"/>
-      </w:pPr>
-      <w:r>
-        <w:t xml:space="preserve">ḫrs¹ ----ḫl----</w:t>
+        <w:t xml:space="preserve">Von ʾšym, Sohn des Drʾl,</w:t>
+      </w:r>
+    </w:p>
+    <w:p>
+      <w:pPr>
+        <w:spacing w:after="40"/>
+      </w:pPr>
+      <w:r>
+        <w:t xml:space="preserve">Sohn des ʾšym, Sohn des Drʾl,</w:t>
+      </w:r>
+    </w:p>
+    <w:p>
+      <w:pPr>
+        <w:spacing w:after="40"/>
+      </w:pPr>
+      <w:r>
+        <w:t xml:space="preserve">Sohn des Kst, Sohn des ʿbd …</w:t>
+      </w:r>
+    </w:p>
+    <w:p>
+      <w:pPr>
+        <w:spacing w:after="40"/>
+      </w:pPr>
+      <w:r>
+        <w:t xml:space="preserve">Sohn des Šrk —</w:t>
+      </w:r>
+    </w:p>
+    <w:p>
+      <w:pPr>
+        <w:spacing w:after="40"/>
+      </w:pPr>
+      <w:r>
+        <w:t xml:space="preserve">ḫrs ----ḫl----</w:t>
       </w:r>
     </w:p>
     <w:p>
@@ -2993,7 +2993,7 @@
         <w:spacing w:after="40"/>
       </w:pPr>
       <w:r>
-        <w:t xml:space="preserve">----, Sohn des ʾs¹lh,</w:t>
+        <w:t xml:space="preserve">----, Sohn des ʾslh,</w:t>
       </w:r>
     </w:p>
     <w:p>
@@ -3009,7 +3009,7 @@
         <w:spacing w:after="40"/>
       </w:pPr>
       <w:r>
-        <w:t xml:space="preserve">[----] ʾs¹ʾ</w:t>
+        <w:t xml:space="preserve">[----] ʾsʾ</w:t>
       </w:r>
     </w:p>
     <w:p>
@@ -3067,7 +3067,7 @@
         <w:spacing w:after="40"/>
       </w:pPr>
       <w:r>
-        <w:t xml:space="preserve">Von S¹ny, Sohn des Ḥwr,</w:t>
+        <w:t xml:space="preserve">Von Sny, Sohn des Ḥwr,</w:t>
       </w:r>
     </w:p>
     <w:p>
@@ -3104,15 +3104,15 @@
         <w:spacing w:after="40"/>
       </w:pPr>
       <w:r>
-        <w:t xml:space="preserve">Von ʿbs¹, Sohn des S²ẓr,</w:t>
-      </w:r>
-    </w:p>
-    <w:p>
-      <w:pPr>
-        <w:spacing w:after="40"/>
-      </w:pPr>
-      <w:r>
-        <w:t xml:space="preserve">und q----ys¹r —</w:t>
+        <w:t xml:space="preserve">Von ʿbs, Sohn des Šẓr,</w:t>
+      </w:r>
+    </w:p>
+    <w:p>
+      <w:pPr>
+        <w:spacing w:after="40"/>
+      </w:pPr>
+      <w:r>
+        <w:t xml:space="preserve">und q----ysr —</w:t>
       </w:r>
     </w:p>
     <w:p>
@@ -3141,23 +3141,23 @@
         <w:spacing w:after="40"/>
       </w:pPr>
       <w:r>
-        <w:t xml:space="preserve">Von Wrs¹, Sohn des ʾglḥ,</w:t>
-      </w:r>
-    </w:p>
-    <w:p>
-      <w:pPr>
-        <w:spacing w:after="40"/>
-      </w:pPr>
-      <w:r>
-        <w:t xml:space="preserve">Sohn des Ys¹lm, Sohn des ʾglḥ,</w:t>
-      </w:r>
-    </w:p>
-    <w:p>
-      <w:pPr>
-        <w:spacing w:after="40"/>
-      </w:pPr>
-      <w:r>
-        <w:t xml:space="preserve">Sohn des ʾs¹l ----.</w:t>
+        <w:t xml:space="preserve">Von Wrs, Sohn des ʾglḥ,</w:t>
+      </w:r>
+    </w:p>
+    <w:p>
+      <w:pPr>
+        <w:spacing w:after="40"/>
+      </w:pPr>
+      <w:r>
+        <w:t xml:space="preserve">Sohn des Yslm, Sohn des ʾglḥ,</w:t>
+      </w:r>
+    </w:p>
+    <w:p>
+      <w:pPr>
+        <w:spacing w:after="40"/>
+      </w:pPr>
+      <w:r>
+        <w:t xml:space="preserve">Sohn des ʾsl ----.</w:t>
       </w:r>
     </w:p>
     <w:p>
@@ -3398,7 +3398,7 @@
         <w:spacing w:after="40"/>
       </w:pPr>
       <w:r>
-        <w:t xml:space="preserve">zum Stamm ˥wḏ.</w:t>
+        <w:t xml:space="preserve">zum Stamm ʿwḏ.</w:t>
       </w:r>
     </w:p>
     <w:p>
@@ -3419,7 +3419,7 @@
         <w:spacing w:after="40"/>
       </w:pPr>
       <w:r>
-        <w:t xml:space="preserve">Er fand die Schrift des Ms¹k</w:t>
+        <w:t xml:space="preserve">Er fand die Schrift des Msk</w:t>
       </w:r>
     </w:p>
     <w:p>
@@ -3970,7 +3970,7 @@
         <w:spacing w:after="40"/>
       </w:pPr>
       <w:r>
-        <w:t xml:space="preserve">um Nr, um Ṣfwn, um Ks¹ṭ,</w:t>
+        <w:t xml:space="preserve">um Nr, um Ṣfwn, um Ksṭ,</w:t>
       </w:r>
     </w:p>
     <w:p>
@@ -4060,7 +4060,7 @@
         <w:spacing w:after="40"/>
       </w:pPr>
       <w:r>
-        <w:t xml:space="preserve">B˥ls¹mn — gib Sicherheit,</w:t>
+        <w:t xml:space="preserve">Bʿlsmn — gib Sicherheit,</w:t>
       </w:r>
     </w:p>
     <w:p>
@@ -4150,7 +4150,7 @@
         <w:spacing w:after="40"/>
       </w:pPr>
       <w:r>
-        <w:t xml:space="preserve">und weinte um den Vater, um ˥bd, um den Oheim,</w:t>
+        <w:t xml:space="preserve">und weinte um den Vater, um ʿbd, um den Oheim,</w:t>
       </w:r>
     </w:p>
     <w:p>
@@ -4288,7 +4288,7 @@
         <w:spacing w:after="40"/>
       </w:pPr>
       <w:r>
-        <w:t xml:space="preserve">um Ḫrg, um Gḥmn, um ʾys¹, um Ẓn.</w:t>
+        <w:t xml:space="preserve">um Ḫrg, um Gḥmn, um ʾys, um Ẓn.</w:t>
       </w:r>
     </w:p>
     <w:p>
@@ -4333,7 +4333,7 @@
         <w:spacing w:after="40"/>
       </w:pPr>
       <w:r>
-        <w:t xml:space="preserve">um ʿqrb, um S¹ḫr,</w:t>
+        <w:t xml:space="preserve">um ʿqrb, um Sḫr,</w:t>
       </w:r>
     </w:p>
     <w:p>
@@ -4386,7 +4386,7 @@
         <w:spacing w:after="40"/>
       </w:pPr>
       <w:r>
-        <w:t xml:space="preserve">um Ḫrg, um Gm, um ʾys¹, um Ẓn.</w:t>
+        <w:t xml:space="preserve">um Ḫrg, um Gm, um ʾys, um Ẓn.</w:t>
       </w:r>
     </w:p>
     <w:p>
@@ -4595,7 +4595,7 @@
         <w:spacing w:after="40"/>
       </w:pPr>
       <w:r>
-        <w:t xml:space="preserve">im Jahr, als die Römer S²mt erschlugen.</w:t>
+        <w:t xml:space="preserve">im Jahr, als die Römer Šmt erschlugen.</w:t>
       </w:r>
     </w:p>
     <w:p>
@@ -4775,31 +4775,31 @@
         <w:spacing w:after="40"/>
       </w:pPr>
       <w:r>
-        <w:t xml:space="preserve">Von Lbʾt, Sohn des Ḫṭs¹t, Sohn des Flṭt,</w:t>
-      </w:r>
-    </w:p>
-    <w:p>
-      <w:pPr>
-        <w:spacing w:after="40"/>
-      </w:pPr>
-      <w:r>
-        <w:t xml:space="preserve">Sohn des Bhs², Sohn des ʾḏnt, Sohn des ʾs¹lm,</w:t>
-      </w:r>
-    </w:p>
-    <w:p>
-      <w:pPr>
-        <w:spacing w:after="40"/>
-      </w:pPr>
-      <w:r>
-        <w:t xml:space="preserve">Sohn des Zkr, Sohn des Rfʾt, Sohn des Ws²yt,</w:t>
-      </w:r>
-    </w:p>
-    <w:p>
-      <w:pPr>
-        <w:spacing w:after="40"/>
-      </w:pPr>
-      <w:r>
-        <w:t xml:space="preserve">Sohn des Ḍf, Sohn des ˥gd, Sohn des T˥wḏ.</w:t>
+        <w:t xml:space="preserve">Von Lbʾt, Sohn des Ḫṭst, Sohn des Flṭt,</w:t>
+      </w:r>
+    </w:p>
+    <w:p>
+      <w:pPr>
+        <w:spacing w:after="40"/>
+      </w:pPr>
+      <w:r>
+        <w:t xml:space="preserve">Sohn des Bhš, Sohn des ʾḏnt, Sohn des ʾslm,</w:t>
+      </w:r>
+    </w:p>
+    <w:p>
+      <w:pPr>
+        <w:spacing w:after="40"/>
+      </w:pPr>
+      <w:r>
+        <w:t xml:space="preserve">Sohn des Zkr, Sohn des Rfʾt, Sohn des Wšyt,</w:t>
+      </w:r>
+    </w:p>
+    <w:p>
+      <w:pPr>
+        <w:spacing w:after="40"/>
+      </w:pPr>
+      <w:r>
+        <w:t xml:space="preserve">Sohn des Ḍf, Sohn des ʿgd, Sohn des Tʿwḏ.</w:t>
       </w:r>
     </w:p>
     <w:p>
@@ -4831,7 +4831,7 @@
         <w:spacing w:after="40"/>
       </w:pPr>
       <w:r>
-        <w:t xml:space="preserve">vom Stamm ʾs²ll —</w:t>
+        <w:t xml:space="preserve">vom Stamm ʾšll —</w:t>
       </w:r>
     </w:p>
     <w:p>
@@ -4855,7 +4855,7 @@
         <w:spacing w:after="40"/>
       </w:pPr>
       <w:r>
-        <w:t xml:space="preserve">Ds²ry und Lt:</w:t>
+        <w:t xml:space="preserve">Dšry und Lt:</w:t>
       </w:r>
     </w:p>
     <w:p>
@@ -5022,7 +5022,7 @@
         <w:spacing w:after="40"/>
       </w:pPr>
       <w:r>
-        <w:t xml:space="preserve">um M˥z, erschlagen,</w:t>
+        <w:t xml:space="preserve">um Mʿz, erschlagen,</w:t>
       </w:r>
     </w:p>
     <w:p>
@@ -5038,15 +5038,15 @@
         <w:spacing w:after="40"/>
       </w:pPr>
       <w:r>
-        <w:t xml:space="preserve">um Ns¹m,</w:t>
-      </w:r>
-    </w:p>
-    <w:p>
-      <w:pPr>
-        <w:spacing w:after="40"/>
-      </w:pPr>
-      <w:r>
-        <w:t xml:space="preserve">und um Ṭr aus dem Stamm S¹mw.</w:t>
+        <w:t xml:space="preserve">um Nsm,</w:t>
+      </w:r>
+    </w:p>
+    <w:p>
+      <w:pPr>
+        <w:spacing w:after="40"/>
+      </w:pPr>
+      <w:r>
+        <w:t xml:space="preserve">und um Ṭr aus dem Stamm Smw.</w:t>
       </w:r>
     </w:p>
     <w:p>
@@ -5202,7 +5202,7 @@
         <w:spacing w:after="40"/>
       </w:pPr>
       <w:r>
-        <w:t xml:space="preserve">um den getöteten S²rk</w:t>
+        <w:t xml:space="preserve">um den getöteten Šrk</w:t>
       </w:r>
     </w:p>
     <w:p>
@@ -5292,7 +5292,7 @@
         <w:spacing w:after="40"/>
       </w:pPr>
       <w:r>
-        <w:t xml:space="preserve">und trauerte um Ks¹ṭ.</w:t>
+        <w:t xml:space="preserve">und trauerte um Ksṭ.</w:t>
       </w:r>
     </w:p>
     <w:p>
@@ -5342,7 +5342,7 @@
         <w:spacing w:after="40"/>
       </w:pPr>
       <w:r>
-        <w:t xml:space="preserve">Er kam zurück von S¹mwt</w:t>
+        <w:t xml:space="preserve">Er kam zurück von Smwt</w:t>
       </w:r>
     </w:p>
     <w:p>
@@ -5490,7 +5490,7 @@
         <w:spacing w:after="40"/>
       </w:pPr>
       <w:r>
-        <w:t xml:space="preserve">und zog nach ʾnks¹r.</w:t>
+        <w:t xml:space="preserve">und zog nach ʾnksr.</w:t>
       </w:r>
     </w:p>
     <w:p>

</xml_diff>